<commit_message>
Workspace setup for AWS CDK code and creating Lambda using stack
</commit_message>
<xml_diff>
--- a/cdk/1/cdk-example/2 CDK for Java Developers.docx
+++ b/cdk/1/cdk-example/2 CDK for Java Developers.docx
@@ -8,8 +8,17 @@
         <w:pBdr>
           <w:bottom w:val="single" w:sz="6" w:space="1" w:color="auto"/>
         </w:pBdr>
-      </w:pPr>
-      <w:r>
+        <w:jc w:val="center"/>
+        <w:rPr>
+          <w:b/>
+          <w:bCs/>
+        </w:rPr>
+      </w:pPr>
+      <w:r>
+        <w:rPr>
+          <w:b/>
+          <w:bCs/>
+        </w:rPr>
         <w:t>CDK for Java Developers</w:t>
       </w:r>
     </w:p>
@@ -62,13 +71,7 @@
         <w:pStyle w:val="Heading3"/>
       </w:pPr>
       <w:r>
-        <w:t xml:space="preserve">What is </w:t>
-      </w:r>
-      <w:r>
-        <w:t>infrastructure provisioning</w:t>
-      </w:r>
-      <w:r>
-        <w:t>?</w:t>
+        <w:t>What is infrastructure provisioning?</w:t>
       </w:r>
     </w:p>
     <w:p>
@@ -176,6 +179,9 @@
     </w:p>
     <w:p>
       <w:r>
+        <w:rPr>
+          <w:noProof/>
+        </w:rPr>
         <w:lastRenderedPageBreak/>
         <w:drawing>
           <wp:inline distT="0" distB="0" distL="0" distR="0" wp14:anchorId="6B129A75" wp14:editId="3E8938F8">
@@ -228,6 +234,9 @@
     </w:p>
     <w:p>
       <w:r>
+        <w:rPr>
+          <w:noProof/>
+        </w:rPr>
         <w:drawing>
           <wp:inline distT="0" distB="0" distL="0" distR="0" wp14:anchorId="2A3D633B" wp14:editId="101495C5">
             <wp:extent cx="5311600" cy="3680779"/>
@@ -278,6 +287,9 @@
     </w:p>
     <w:p>
       <w:r>
+        <w:rPr>
+          <w:noProof/>
+        </w:rPr>
         <w:drawing>
           <wp:inline distT="0" distB="0" distL="0" distR="0" wp14:anchorId="563BE543" wp14:editId="5A661443">
             <wp:extent cx="5731510" cy="3328670"/>
@@ -1109,7 +1121,7 @@
           <w14:ligatures w14:val="none"/>
         </w:rPr>
         <w:pict w14:anchorId="0F8AA18F">
-          <v:rect id="_x0000_i1142" style="width:0;height:1.5pt" o:hralign="center" o:hrstd="t" o:hrnoshade="t" o:hr="t" fillcolor="gray" stroked="f"/>
+          <v:rect id="_x0000_i1025" style="width:0;height:1.5pt" o:hralign="center" o:hrstd="t" o:hrnoshade="t" o:hr="t" fillcolor="gray" stroked="f"/>
         </w:pict>
       </w:r>
     </w:p>
@@ -1966,7 +1978,7 @@
           <w14:ligatures w14:val="none"/>
         </w:rPr>
         <w:pict w14:anchorId="546492BC">
-          <v:rect id="_x0000_i1143" style="width:0;height:1.5pt" o:hralign="center" o:hrstd="t" o:hrnoshade="t" o:hr="t" fillcolor="gray" stroked="f"/>
+          <v:rect id="_x0000_i1026" style="width:0;height:1.5pt" o:hralign="center" o:hrstd="t" o:hrnoshade="t" o:hr="t" fillcolor="gray" stroked="f"/>
         </w:pict>
       </w:r>
     </w:p>
@@ -2765,7 +2777,7 @@
           <w14:ligatures w14:val="none"/>
         </w:rPr>
         <w:pict w14:anchorId="315E2172">
-          <v:rect id="_x0000_i1144" style="width:0;height:1.5pt" o:hralign="center" o:hrstd="t" o:hrnoshade="t" o:hr="t" fillcolor="gray" stroked="f"/>
+          <v:rect id="_x0000_i1027" style="width:0;height:1.5pt" o:hralign="center" o:hrstd="t" o:hrnoshade="t" o:hr="t" fillcolor="gray" stroked="f"/>
         </w:pict>
       </w:r>
     </w:p>
@@ -3529,7 +3541,7 @@
           <w14:ligatures w14:val="none"/>
         </w:rPr>
         <w:pict w14:anchorId="73A5D1EA">
-          <v:rect id="_x0000_i1211" style="width:0;height:1.5pt" o:hralign="center" o:hrstd="t" o:hr="t" fillcolor="#a0a0a0" stroked="f"/>
+          <v:rect id="_x0000_i1028" style="width:0;height:1.5pt" o:hralign="center" o:hrstd="t" o:hr="t" fillcolor="#a0a0a0" stroked="f"/>
         </w:pict>
       </w:r>
     </w:p>
@@ -3897,7 +3909,7 @@
           <w14:ligatures w14:val="none"/>
         </w:rPr>
         <w:pict w14:anchorId="3B72E183">
-          <v:rect id="_x0000_i1212" style="width:0;height:1.5pt" o:hralign="center" o:hrstd="t" o:hr="t" fillcolor="#a0a0a0" stroked="f"/>
+          <v:rect id="_x0000_i1029" style="width:0;height:1.5pt" o:hralign="center" o:hrstd="t" o:hr="t" fillcolor="#a0a0a0" stroked="f"/>
         </w:pict>
       </w:r>
     </w:p>
@@ -4186,7 +4198,7 @@
           <w14:ligatures w14:val="none"/>
         </w:rPr>
         <w:pict w14:anchorId="414240D2">
-          <v:rect id="_x0000_i1213" style="width:0;height:1.5pt" o:hralign="center" o:hrstd="t" o:hr="t" fillcolor="#a0a0a0" stroked="f"/>
+          <v:rect id="_x0000_i1030" style="width:0;height:1.5pt" o:hralign="center" o:hrstd="t" o:hr="t" fillcolor="#a0a0a0" stroked="f"/>
         </w:pict>
       </w:r>
     </w:p>
@@ -5233,7 +5245,7 @@
           <w14:ligatures w14:val="none"/>
         </w:rPr>
         <w:pict w14:anchorId="4C8CF153">
-          <v:rect id="_x0000_i1416" style="width:0;height:1.5pt" o:hralign="center" o:hrstd="t" o:hrnoshade="t" o:hr="t" fillcolor="gray" stroked="f"/>
+          <v:rect id="_x0000_i1031" style="width:0;height:1.5pt" o:hralign="center" o:hrstd="t" o:hrnoshade="t" o:hr="t" fillcolor="gray" stroked="f"/>
         </w:pict>
       </w:r>
     </w:p>
@@ -5514,7 +5526,7 @@
           <w14:ligatures w14:val="none"/>
         </w:rPr>
         <w:pict w14:anchorId="5612C8E7">
-          <v:rect id="_x0000_i1417" style="width:0;height:1.5pt" o:hralign="center" o:hrstd="t" o:hrnoshade="t" o:hr="t" fillcolor="gray" stroked="f"/>
+          <v:rect id="_x0000_i1032" style="width:0;height:1.5pt" o:hralign="center" o:hrstd="t" o:hrnoshade="t" o:hr="t" fillcolor="gray" stroked="f"/>
         </w:pict>
       </w:r>
     </w:p>
@@ -6619,7 +6631,7 @@
           <w14:ligatures w14:val="none"/>
         </w:rPr>
         <w:pict w14:anchorId="26D1E663">
-          <v:rect id="_x0000_i1280" style="width:0;height:1.5pt" o:hralign="center" o:hrstd="t" o:hr="t" fillcolor="#a0a0a0" stroked="f"/>
+          <v:rect id="_x0000_i1033" style="width:0;height:1.5pt" o:hralign="center" o:hrstd="t" o:hr="t" fillcolor="#a0a0a0" stroked="f"/>
         </w:pict>
       </w:r>
     </w:p>
@@ -6874,7 +6886,7 @@
           <w14:ligatures w14:val="none"/>
         </w:rPr>
         <w:pict w14:anchorId="5D803CE7">
-          <v:rect id="_x0000_i1281" style="width:0;height:1.5pt" o:hralign="center" o:hrstd="t" o:hr="t" fillcolor="#a0a0a0" stroked="f"/>
+          <v:rect id="_x0000_i1034" style="width:0;height:1.5pt" o:hralign="center" o:hrstd="t" o:hr="t" fillcolor="#a0a0a0" stroked="f"/>
         </w:pict>
       </w:r>
     </w:p>
@@ -7366,7 +7378,7 @@
           <w14:ligatures w14:val="none"/>
         </w:rPr>
         <w:pict w14:anchorId="1BAD5B10">
-          <v:rect id="_x0000_i1282" style="width:0;height:1.5pt" o:hralign="center" o:hrstd="t" o:hr="t" fillcolor="#a0a0a0" stroked="f"/>
+          <v:rect id="_x0000_i1035" style="width:0;height:1.5pt" o:hralign="center" o:hrstd="t" o:hr="t" fillcolor="#a0a0a0" stroked="f"/>
         </w:pict>
       </w:r>
     </w:p>
@@ -8175,7 +8187,7 @@
           <w14:ligatures w14:val="none"/>
         </w:rPr>
         <w:pict w14:anchorId="3E4D3AB2">
-          <v:rect id="_x0000_i1322" style="width:0;height:1.5pt" o:hralign="center" o:hrstd="t" o:hrnoshade="t" o:hr="t" fillcolor="gray" stroked="f"/>
+          <v:rect id="_x0000_i1036" style="width:0;height:1.5pt" o:hralign="center" o:hrstd="t" o:hrnoshade="t" o:hr="t" fillcolor="gray" stroked="f"/>
         </w:pict>
       </w:r>
     </w:p>
@@ -8518,7 +8530,7 @@
           <w14:ligatures w14:val="none"/>
         </w:rPr>
         <w:pict w14:anchorId="33D1986E">
-          <v:rect id="_x0000_i1323" style="width:0;height:1.5pt" o:hralign="center" o:hrstd="t" o:hrnoshade="t" o:hr="t" fillcolor="gray" stroked="f"/>
+          <v:rect id="_x0000_i1037" style="width:0;height:1.5pt" o:hralign="center" o:hrstd="t" o:hrnoshade="t" o:hr="t" fillcolor="gray" stroked="f"/>
         </w:pict>
       </w:r>
     </w:p>
@@ -8989,7 +9001,7 @@
           <w14:ligatures w14:val="none"/>
         </w:rPr>
         <w:pict w14:anchorId="0AD17EAB">
-          <v:rect id="_x0000_i1324" style="width:0;height:1.5pt" o:hralign="center" o:hrstd="t" o:hrnoshade="t" o:hr="t" fillcolor="gray" stroked="f"/>
+          <v:rect id="_x0000_i1038" style="width:0;height:1.5pt" o:hralign="center" o:hrstd="t" o:hrnoshade="t" o:hr="t" fillcolor="gray" stroked="f"/>
         </w:pict>
       </w:r>
     </w:p>
@@ -10362,7 +10374,7 @@
           <w14:ligatures w14:val="none"/>
         </w:rPr>
         <w:pict w14:anchorId="7083DDCD">
-          <v:rect id="_x0000_i1370" style="width:0;height:1.5pt" o:hralign="center" o:hrstd="t" o:hrnoshade="t" o:hr="t" fillcolor="gray" stroked="f"/>
+          <v:rect id="_x0000_i1039" style="width:0;height:1.5pt" o:hralign="center" o:hrstd="t" o:hrnoshade="t" o:hr="t" fillcolor="gray" stroked="f"/>
         </w:pict>
       </w:r>
     </w:p>
@@ -10586,7 +10598,7 @@
           <w14:ligatures w14:val="none"/>
         </w:rPr>
         <w:pict w14:anchorId="0DE0F4F1">
-          <v:rect id="_x0000_i1371" style="width:0;height:1.5pt" o:hralign="center" o:hrstd="t" o:hrnoshade="t" o:hr="t" fillcolor="gray" stroked="f"/>
+          <v:rect id="_x0000_i1040" style="width:0;height:1.5pt" o:hralign="center" o:hrstd="t" o:hrnoshade="t" o:hr="t" fillcolor="gray" stroked="f"/>
         </w:pict>
       </w:r>
     </w:p>
@@ -15375,6 +15387,7 @@
   <w:style w:type="character" w:default="1" w:styleId="DefaultParagraphFont">
     <w:name w:val="Default Paragraph Font"/>
     <w:uiPriority w:val="1"/>
+    <w:semiHidden/>
     <w:unhideWhenUsed/>
   </w:style>
   <w:style w:type="table" w:default="1" w:styleId="TableNormal">

</xml_diff>